<commit_message>
feat: add welcome screen with auto-dismiss functionality and styling
- Implemented a welcome screen that locks scroll and auto-dismisses after 6 seconds.
- Added styles for the welcome screen, including animations and responsive design.
- Updated project card styles to include image scaling and dark overlay for better readability.
- Adjusted hamburger menu styles for improved visibility.
</commit_message>
<xml_diff>
--- a/Abdulrahmon_CV.docx
+++ b/Abdulrahmon_CV.docx
@@ -24,12 +24,6 @@
         <w:gridCol w:w="7344"/>
       </w:tblGrid>
       <w:tr>
-        <w:tblPrEx>
-          <w:tblCellMar>
-            <w:top w:w="0" w:type="dxa"/>
-            <w:bottom w:w="0" w:type="dxa"/>
-          </w:tblCellMar>
-        </w:tblPrEx>
         <w:tc>
           <w:tcPr>
             <w:tcW w:w="3200" w:type="dxa"/>
@@ -256,53 +250,39 @@
                   <w:sz w:val="16"/>
                   <w:szCs w:val="16"/>
                 </w:rPr>
-                <w:t>https://www.linkedin.com/in/abdulrahmon-adegoke-o-8466b4</w:t>
+                <w:t>https://www.linkedin.com/in/abdulrahmon-adegoke-o-8466b4247/</w:t>
               </w:r>
+            </w:hyperlink>
+          </w:p>
+          <w:p>
+            <w:pPr>
+              <w:spacing w:after="30"/>
+            </w:pPr>
+            <w:r>
+              <w:rPr>
+                <w:b/>
+                <w:bCs/>
+                <w:color w:val="0DDF82"/>
+                <w:sz w:val="16"/>
+                <w:szCs w:val="16"/>
+              </w:rPr>
+              <w:t>WhatsApp</w:t>
+            </w:r>
+          </w:p>
+          <w:p>
+            <w:pPr>
+              <w:spacing w:after="80"/>
+            </w:pPr>
+            <w:hyperlink r:id="rId7" w:history="1">
               <w:r>
                 <w:rPr>
                   <w:rStyle w:val="Hyperlink"/>
                   <w:sz w:val="16"/>
                   <w:szCs w:val="16"/>
                 </w:rPr>
-                <w:t>2</w:t>
-              </w:r>
-              <w:r>
-                <w:rPr>
-                  <w:rStyle w:val="Hyperlink"/>
-                  <w:sz w:val="16"/>
-                  <w:szCs w:val="16"/>
-                </w:rPr>
-                <w:t>47/</w:t>
+                <w:t>+234 9061707275</w:t>
               </w:r>
             </w:hyperlink>
-          </w:p>
-          <w:p>
-            <w:pPr>
-              <w:spacing w:after="30"/>
-            </w:pPr>
-            <w:r>
-              <w:rPr>
-                <w:b/>
-                <w:bCs/>
-                <w:color w:val="0DDF82"/>
-                <w:sz w:val="16"/>
-                <w:szCs w:val="16"/>
-              </w:rPr>
-              <w:t>WhatsApp</w:t>
-            </w:r>
-          </w:p>
-          <w:p>
-            <w:pPr>
-              <w:spacing w:after="80"/>
-            </w:pPr>
-            <w:r>
-              <w:rPr>
-                <w:color w:val="E0E0E0"/>
-                <w:sz w:val="16"/>
-                <w:szCs w:val="16"/>
-              </w:rPr>
-              <w:t>+234 9061707275</w:t>
-            </w:r>
           </w:p>
           <w:p>
             <w:pPr>
@@ -2177,46 +2157,14 @@
               </w:rPr>
               <w:t xml:space="preserve">thescalepeedia@gmail.com | </w:t>
             </w:r>
-            <w:hyperlink r:id="rId7" w:history="1">
+            <w:hyperlink r:id="rId8" w:history="1">
               <w:r>
                 <w:rPr>
                   <w:rStyle w:val="Hyperlink"/>
                   <w:sz w:val="15"/>
                   <w:szCs w:val="15"/>
                 </w:rPr>
-                <w:t>linkedin.com</w:t>
-              </w:r>
-              <w:r>
-                <w:rPr>
-                  <w:rStyle w:val="Hyperlink"/>
-                  <w:sz w:val="15"/>
-                  <w:szCs w:val="15"/>
-                </w:rPr>
-                <w:t>/in/abdulrahmon-ade</w:t>
-              </w:r>
-              <w:r>
-                <w:rPr>
-                  <w:rStyle w:val="Hyperlink"/>
-                  <w:sz w:val="15"/>
-                  <w:szCs w:val="15"/>
-                </w:rPr>
-                <w:t>g</w:t>
-              </w:r>
-              <w:r>
-                <w:rPr>
-                  <w:rStyle w:val="Hyperlink"/>
-                  <w:sz w:val="15"/>
-                  <w:szCs w:val="15"/>
-                </w:rPr>
-                <w:t>oke-o-8466b</w:t>
-              </w:r>
-              <w:r>
-                <w:rPr>
-                  <w:rStyle w:val="Hyperlink"/>
-                  <w:sz w:val="15"/>
-                  <w:szCs w:val="15"/>
-                </w:rPr>
-                <w:t>4247</w:t>
+                <w:t>linkedin.com/in/abdulrahmon-adegoke-o-8466b4247</w:t>
               </w:r>
             </w:hyperlink>
             <w:r>
@@ -2225,15 +2173,7 @@
                 <w:sz w:val="15"/>
                 <w:szCs w:val="15"/>
               </w:rPr>
-              <w:t xml:space="preserve"> | Scale</w:t>
-            </w:r>
-            <w:r>
-              <w:rPr>
-                <w:color w:val="018C54"/>
-                <w:sz w:val="15"/>
-                <w:szCs w:val="15"/>
-              </w:rPr>
-              <w:t xml:space="preserve"> </w:t>
+              <w:t xml:space="preserve"> | Scale </w:t>
             </w:r>
             <w:proofErr w:type="spellStart"/>
             <w:r>

</xml_diff>